<commit_message>
Restructuration IAM 360° - Architecture modulaire
- Environnements: local (Docker Compose) + cloud (Terraform)
- Services: SIRH API, MidPoint, Keycloak, LDAP, Vault
- Monitoring: Prometheus + Grafana
- Scripts: init, reset, backup (PowerShell + Bash)
- Documentation: architecture + guides
</commit_message>
<xml_diff>
--- a/docs/DAT_IAM360.docx
+++ b/docs/DAT_IAM360.docx
@@ -10,6 +10,7 @@
           <w:docPartUnique/>
         </w:docPartObj>
       </w:sdtPr>
+      <w:sdtEndPr/>
       <w:sdtContent>
         <w:p/>
         <w:tbl>
@@ -47,6 +48,7 @@
                 <w:dataBinding w:prefixMappings="xmlns:ns0='http://schemas.openxmlformats.org/officeDocument/2006/extended-properties'" w:xpath="/ns0:Properties[1]/ns0:Company[1]" w:storeItemID="{6668398D-A668-4E3E-A5EB-62B293D839F1}"/>
                 <w:text/>
               </w:sdtPr>
+              <w:sdtEndPr/>
               <w:sdtContent>
                 <w:tc>
                   <w:tcPr>
@@ -103,6 +105,7 @@
                   <w:dataBinding w:prefixMappings="xmlns:ns0='http://schemas.openxmlformats.org/package/2006/metadata/core-properties' xmlns:ns1='http://purl.org/dc/elements/1.1/'" w:xpath="/ns0:coreProperties[1]/ns1:title[1]" w:storeItemID="{6C3C8BC8-F283-45AE-878A-BAB7291924A1}"/>
                   <w:text/>
                 </w:sdtPr>
+                <w:sdtEndPr/>
                 <w:sdtContent>
                   <w:p>
                     <w:pPr>
@@ -166,6 +169,7 @@
                 <w:dataBinding w:prefixMappings="xmlns:ns0='http://schemas.openxmlformats.org/package/2006/metadata/core-properties' xmlns:ns1='http://purl.org/dc/elements/1.1/'" w:xpath="/ns0:coreProperties[1]/ns1:subject[1]" w:storeItemID="{6C3C8BC8-F283-45AE-878A-BAB7291924A1}"/>
                 <w:text/>
               </w:sdtPr>
+              <w:sdtEndPr/>
               <w:sdtContent>
                 <w:tc>
                   <w:tcPr>
@@ -232,6 +236,7 @@
           <w:docPartUnique/>
         </w:docPartObj>
       </w:sdtPr>
+      <w:sdtEndPr/>
       <w:sdtContent>
         <w:p>
           <w:pPr>
@@ -3797,10 +3802,7 @@
         <w:t xml:space="preserve">) </w:t>
       </w:r>
       <w:r>
-        <w:t>et</w:t>
-      </w:r>
-      <w:r>
-        <w:t xml:space="preserve"> les pipelines CI/CD</w:t>
+        <w:t>et les pipelines CI/CD</w:t>
       </w:r>
       <w:r>
         <w:t> ;</w:t>
@@ -4181,13 +4183,7 @@
         <w:ind w:firstLine="708"/>
       </w:pPr>
       <w:r>
-        <w:t xml:space="preserve">Dans un environnement où les règles se durcissent (RGPD, DORA, NIS2), il est temps de simplifier et de sécuriser. Une solution IAM robuste, automatisée et unifiée apporte une réponse </w:t>
-      </w:r>
-      <w:r>
-        <w:t>directe :</w:t>
-      </w:r>
-      <w:r>
-        <w:t xml:space="preserve"> moins de tâches à faible valeur, des accès mieux maîtrisés, et des preuves d’audit disponibles quand on en a besoin. C’est une base saine pour travailler plus sereinement, chaque jour.</w:t>
+        <w:t>Dans un environnement où les règles se durcissent (RGPD, DORA, NIS2), il est temps de simplifier et de sécuriser. Une solution IAM robuste, automatisée et unifiée apporte une réponse directe : moins de tâches à faible valeur, des accès mieux maîtrisés, et des preuves d’audit disponibles quand on en a besoin. C’est une base saine pour travailler plus sereinement, chaque jour.</w:t>
       </w:r>
     </w:p>
     <w:p>
@@ -4278,13 +4274,7 @@
         </w:numPr>
       </w:pPr>
       <w:r>
-        <w:t xml:space="preserve">Zero </w:t>
-      </w:r>
-      <w:r>
-        <w:t>Trust :</w:t>
-      </w:r>
-      <w:r>
-        <w:t xml:space="preserve"> Never trust, </w:t>
+        <w:t xml:space="preserve">Zero Trust : Never trust, </w:t>
       </w:r>
       <w:proofErr w:type="spellStart"/>
       <w:r>
@@ -4326,10 +4316,7 @@
         </w:numPr>
       </w:pPr>
       <w:r>
-        <w:t>Centralisation :</w:t>
-      </w:r>
-      <w:r>
-        <w:t xml:space="preserve"> unification d’IGA, AM, PAM, AI/SOAR et gouvernance des données pour une vision unique et des décisions cohérentes</w:t>
+        <w:t>Centralisation : unification d’IGA, AM, PAM, AI/SOAR et gouvernance des données pour une vision unique et des décisions cohérentes</w:t>
       </w:r>
       <w:r>
         <w:t> ;</w:t>
@@ -4424,13 +4411,13 @@
     <w:p>
       <w:r>
         <w:lastRenderedPageBreak/>
-        <w:t xml:space="preserve">Ce projet vise à rendre la vie plus simple et plus sûre pour </w:t>
-      </w:r>
-      <w:r>
-        <w:t>tous :</w:t>
-      </w:r>
-      <w:r>
-        <w:t xml:space="preserve"> moins de risques, moins de tâches manuelles et plus de contrôle sur qui accède à quoi.</w:t>
+        <w:t xml:space="preserve">Ce projet vise à rendre la </w:t>
+      </w:r>
+      <w:r>
+        <w:t>gestion de l’identité</w:t>
+      </w:r>
+      <w:r>
+        <w:t xml:space="preserve"> plus simple et plus sûre pour tous : moins de risques, moins de tâches manuelles et plus de contrôle sur qui accède à quoi.</w:t>
       </w:r>
     </w:p>
     <w:p>
@@ -4522,7 +4509,13 @@
         </w:numPr>
       </w:pPr>
       <w:r>
-        <w:t xml:space="preserve">Rester conforme en continu aux règles comme RGPD, ISO 27001 et NIS2, </w:t>
+        <w:t>Rester conforme en continu</w:t>
+      </w:r>
+      <w:r>
+        <w:t xml:space="preserve"> sur la partie identité</w:t>
+      </w:r>
+      <w:r>
+        <w:t xml:space="preserve"> aux règles comme RGPD, ISO 27001 et NIS2, </w:t>
       </w:r>
       <w:r>
         <w:t>DORA</w:t>
@@ -4710,13 +4703,7 @@
               <w:cnfStyle w:val="000000000000" w:firstRow="0" w:lastRow="0" w:firstColumn="0" w:lastColumn="0" w:oddVBand="0" w:evenVBand="0" w:oddHBand="0" w:evenHBand="0" w:firstRowFirstColumn="0" w:firstRowLastColumn="0" w:lastRowFirstColumn="0" w:lastRowLastColumn="0"/>
             </w:pPr>
             <w:r>
-              <w:t xml:space="preserve">Un nouvel arrivant opérationnel en </w:t>
-            </w:r>
-            <w:r>
-              <w:t>minutes ;</w:t>
-            </w:r>
-            <w:r>
-              <w:t xml:space="preserve"> un départ sans traîner des droits derrière lui.</w:t>
+              <w:t>Un nouvel arrivant opérationnel en minutes ; un départ sans traîner des droits derrière lui.</w:t>
             </w:r>
           </w:p>
         </w:tc>
@@ -4880,6 +4867,7 @@
               <w:spacing w:after="200" w:line="276" w:lineRule="auto"/>
             </w:pPr>
             <w:r>
+              <w:lastRenderedPageBreak/>
               <w:t>Posture Zero Trust</w:t>
             </w:r>
           </w:p>
@@ -4910,13 +4898,7 @@
               <w:cnfStyle w:val="000000000000" w:firstRow="0" w:lastRow="0" w:firstColumn="0" w:lastColumn="0" w:oddVBand="0" w:evenVBand="0" w:oddHBand="0" w:evenHBand="0" w:firstRowFirstColumn="0" w:firstRowLastColumn="0" w:lastRowFirstColumn="0" w:lastRowLastColumn="0"/>
             </w:pPr>
             <w:r>
-              <w:t xml:space="preserve">MFA, accès conditionnels et privilèges </w:t>
-            </w:r>
-            <w:r>
-              <w:t>temporaires :</w:t>
-            </w:r>
-            <w:r>
-              <w:t xml:space="preserve"> les risques restent sous contrôle.</w:t>
+              <w:t>MFA, accès conditionnels et privilèges temporaires : les risques restent sous contrôle.</w:t>
             </w:r>
           </w:p>
         </w:tc>
@@ -4936,7 +4918,6 @@
               <w:spacing w:after="200" w:line="276" w:lineRule="auto"/>
             </w:pPr>
             <w:r>
-              <w:lastRenderedPageBreak/>
               <w:t>Expérience utilisateur</w:t>
             </w:r>
           </w:p>
@@ -4989,19 +4970,13 @@
         <w:ind w:firstLine="432"/>
       </w:pPr>
       <w:r>
-        <w:t xml:space="preserve">Aujourd’hui, trop de tâches sont manuelles et </w:t>
-      </w:r>
-      <w:r>
-        <w:t>dispersées :</w:t>
-      </w:r>
-      <w:r>
-        <w:t xml:space="preserve"> créer un compte prend du temps, les accès ne sont pas toujours cohérents, et la visibilité est partielle. La cible est </w:t>
-      </w:r>
-      <w:r>
-        <w:t>simple :</w:t>
-      </w:r>
-      <w:r>
-        <w:t xml:space="preserve"> une plateforme unifiée qui automatise, sécurise et rend les choses plus fluides pour tout le monde.</w:t>
+        <w:t xml:space="preserve">Aujourd’hui, trop de tâches sont manuelles et dispersées : créer un compte prend du temps, les accès ne sont pas toujours cohérents, et la visibilité est partielle. La cible est simple : une plateforme unifiée qui automatise, sécurise et rend les choses plus fluides pour </w:t>
+      </w:r>
+      <w:r>
+        <w:t>la gestion des identités et des accès</w:t>
+      </w:r>
+      <w:r>
+        <w:t>.</w:t>
       </w:r>
     </w:p>
     <w:tbl>
@@ -5489,7 +5464,13 @@
     </w:p>
     <w:p>
       <w:r>
-        <w:t>L'architecture s'articule autour de cinq piliers fondamentaux, chacun adressant un domaine critique de la gouvernance des identités :</w:t>
+        <w:t>L'architecture</w:t>
+      </w:r>
+      <w:r>
+        <w:t xml:space="preserve"> cible</w:t>
+      </w:r>
+      <w:r>
+        <w:t xml:space="preserve"> s'articule autour de cinq piliers fondamentaux, chacun adressant un domaine critique de la gouvernance des identités :</w:t>
       </w:r>
     </w:p>
     <w:p>
@@ -5527,7 +5508,11 @@
         <w:ind w:left="708"/>
       </w:pPr>
       <w:r>
-        <w:t xml:space="preserve">Gère le cycle de vie complet des identités : création, modification et suppression automatiques en fonction des événements RH, application des rôles (RBAC), détection des violations de séparation des tâches </w:t>
+        <w:t xml:space="preserve">Gère le cycle de vie complet des identités : création, modification et suppression automatiques en fonction des événements RH, application des rôles (RBAC), détection </w:t>
+      </w:r>
+      <w:r>
+        <w:lastRenderedPageBreak/>
+        <w:t xml:space="preserve">des violations de séparation des tâches </w:t>
       </w:r>
       <w:proofErr w:type="spellStart"/>
       <w:r>
@@ -5592,7 +5577,6 @@
         <w:ind w:left="708"/>
       </w:pPr>
       <w:r>
-        <w:lastRenderedPageBreak/>
         <w:t>Fournit l'authentification unique centralisée (SSO), l'authentification multi-facteur obligatoire et la gestion des accès conditionnels basée sur le contexte et la posture de risque de l'utilisateur.</w:t>
       </w:r>
     </w:p>
@@ -5997,6 +5981,7 @@
           <w:p>
             <w:pPr>
               <w:spacing w:after="200" w:line="276" w:lineRule="auto"/>
+              <w:jc w:val="center"/>
             </w:pPr>
             <w:r>
               <w:t xml:space="preserve">Data </w:t>
@@ -6048,7 +6033,7 @@
         </w:rPr>
         <w:lastRenderedPageBreak/>
         <w:drawing>
-          <wp:anchor distT="0" distB="0" distL="114300" distR="114300" simplePos="0" relativeHeight="251660288" behindDoc="0" locked="0" layoutInCell="1" allowOverlap="1" wp14:anchorId="0AEF97B3" wp14:editId="24FD3488">
+          <wp:anchor distT="0" distB="0" distL="114300" distR="114300" simplePos="0" relativeHeight="251660288" behindDoc="0" locked="0" layoutInCell="1" allowOverlap="1" wp14:anchorId="0AEF97B3" wp14:editId="0E51131B">
             <wp:simplePos x="0" y="0"/>
             <wp:positionH relativeFrom="margin">
               <wp:align>right</wp:align>
@@ -6197,25 +6182,37 @@
         </w:rPr>
         <w:t xml:space="preserve">AD </w:t>
       </w:r>
+      <w:r>
+        <w:rPr>
+          <w:lang w:eastAsia="fr-FR"/>
+        </w:rPr>
+        <w:t>Connect,</w:t>
+      </w:r>
+      <w:r>
+        <w:rPr>
+          <w:lang w:eastAsia="fr-FR"/>
+        </w:rPr>
+        <w:t xml:space="preserve"> </w:t>
+      </w:r>
       <w:proofErr w:type="gramStart"/>
       <w:r>
         <w:rPr>
           <w:lang w:eastAsia="fr-FR"/>
         </w:rPr>
-        <w:t>Connect,</w:t>
-      </w:r>
-      <w:r>
-        <w:rPr>
-          <w:lang w:eastAsia="fr-FR"/>
-        </w:rPr>
         <w:t>(</w:t>
       </w:r>
+      <w:r>
+        <w:rPr>
+          <w:lang w:eastAsia="fr-FR"/>
+        </w:rPr>
+        <w:t xml:space="preserve"> VPN</w:t>
+      </w:r>
       <w:proofErr w:type="gramEnd"/>
       <w:r>
         <w:rPr>
           <w:lang w:eastAsia="fr-FR"/>
         </w:rPr>
-        <w:t xml:space="preserve"> VPN/</w:t>
+        <w:t>/</w:t>
       </w:r>
       <w:proofErr w:type="spellStart"/>
       <w:r>
@@ -6452,7 +6449,15 @@
           <w:bCs/>
           <w:lang w:eastAsia="fr-FR"/>
         </w:rPr>
-        <w:t>six piliers</w:t>
+        <w:t xml:space="preserve">six </w:t>
+      </w:r>
+      <w:r>
+        <w:rPr>
+          <w:b/>
+          <w:bCs/>
+          <w:lang w:eastAsia="fr-FR"/>
+        </w:rPr>
+        <w:t>axes</w:t>
       </w:r>
       <w:r>
         <w:rPr>
@@ -7176,10 +7181,7 @@
         <w:t>RGPD</w:t>
       </w:r>
       <w:r>
-        <w:t xml:space="preserve"> : pseudonymisation des données, registre des traitements, notification &lt; 72h en cas d'incident</w:t>
-      </w:r>
-      <w:r>
-        <w:t> ;</w:t>
+        <w:t xml:space="preserve"> : pseudonymisation des données, registre des traitements, notification &lt; 72h en cas d'incident ;</w:t>
       </w:r>
     </w:p>
     <w:p>
@@ -7198,10 +7200,7 @@
         <w:t xml:space="preserve">ISO 27001 </w:t>
       </w:r>
       <w:r>
-        <w:t>: contrôles d'accès (A.6-A.9), chiffrement (A.10), audit régulier (A.12.4)</w:t>
-      </w:r>
-      <w:r>
-        <w:t> ;</w:t>
+        <w:t>: contrôles d'accès (A.6-A.9), chiffrement (A.10), audit régulier (A.12.4) ;</w:t>
       </w:r>
     </w:p>
     <w:p>
@@ -7230,18 +7229,12 @@
         <w:t>PRA/PCA</w:t>
       </w:r>
       <w:r>
-        <w:t xml:space="preserve"> opérationnel, signalement des incidents critiques</w:t>
-      </w:r>
-      <w:r>
-        <w:t>.</w:t>
+        <w:t xml:space="preserve"> opérationnel, signalement des incidents critiques.</w:t>
       </w:r>
     </w:p>
     <w:p>
       <w:pPr>
         <w:ind w:firstLine="708"/>
-        <w:rPr>
-          <w:lang w:val="en-US"/>
-        </w:rPr>
       </w:pPr>
     </w:p>
     <w:p>
@@ -7761,10 +7754,7 @@
         <w:ind w:firstLine="432"/>
       </w:pPr>
       <w:r>
-        <w:t xml:space="preserve">Le modèle DevOps IAM garantit une Infrastructure as Code, des déploiements reproductibles et traçables, ainsi qu’une sécurité intégrée à chaque étape du cycle de vie </w:t>
-      </w:r>
-      <w:r>
-        <w:t>applicatif</w:t>
+        <w:t>Le modèle DevOps IAM garantit une Infrastructure as Code, des déploiements reproductibles et traçables, ainsi qu’une sécurité intégrée à chaque étape du cycle de vie applicatif</w:t>
       </w:r>
       <w:r>
         <w:t xml:space="preserve"> :</w:t>
@@ -8639,19 +8629,7 @@
         <w:rPr>
           <w:lang w:eastAsia="fr-FR"/>
         </w:rPr>
-        <w:t xml:space="preserve"> orchestre les réponses en temps </w:t>
-      </w:r>
-      <w:r>
-        <w:rPr>
-          <w:lang w:eastAsia="fr-FR"/>
-        </w:rPr>
-        <w:t>réel :</w:t>
-      </w:r>
-      <w:r>
-        <w:rPr>
-          <w:lang w:eastAsia="fr-FR"/>
-        </w:rPr>
-        <w:t xml:space="preserve"> envoi d’alertes, notifications ciblées ou révocation immédiate d’un accès risqué</w:t>
+        <w:t xml:space="preserve"> orchestre les réponses en temps réel : envoi d’alertes, notifications ciblées ou révocation immédiate d’un accès risqué</w:t>
       </w:r>
       <w:r>
         <w:rPr>
@@ -9055,27 +9033,13 @@
           <w:bCs/>
           <w:lang w:eastAsia="fr-FR"/>
         </w:rPr>
-        <w:t xml:space="preserve">Sauvegardes et </w:t>
-      </w:r>
-      <w:r>
-        <w:rPr>
-          <w:b/>
-          <w:bCs/>
-          <w:lang w:eastAsia="fr-FR"/>
-        </w:rPr>
-        <w:t>réplications</w:t>
-      </w:r>
-      <w:r>
-        <w:rPr>
-          <w:lang w:eastAsia="fr-FR"/>
-        </w:rPr>
-        <w:t xml:space="preserve"> :</w:t>
-      </w:r>
-      <w:r>
-        <w:rPr>
-          <w:lang w:eastAsia="fr-FR"/>
-        </w:rPr>
-        <w:t xml:space="preserve"> automatisées, testées régulièrement, et alignées au PRA/PCA pour garantir des objectifs RPO/RTO conformes.</w:t>
+        <w:t>Sauvegardes et réplications</w:t>
+      </w:r>
+      <w:r>
+        <w:rPr>
+          <w:lang w:eastAsia="fr-FR"/>
+        </w:rPr>
+        <w:t xml:space="preserve"> : automatisées, testées régulièrement, et alignées au PRA/PCA pour garantir des objectifs RPO/RTO conformes.</w:t>
       </w:r>
       <w:r>
         <w:rPr>
@@ -9972,19 +9936,7 @@
         <w:rPr>
           <w:lang w:eastAsia="fr-FR"/>
         </w:rPr>
-        <w:t xml:space="preserve">Pour les équipes comme pour les utilisateurs, les bénéfices sont concrets au </w:t>
-      </w:r>
-      <w:r>
-        <w:rPr>
-          <w:lang w:eastAsia="fr-FR"/>
-        </w:rPr>
-        <w:t>quotidien :</w:t>
-      </w:r>
-      <w:r>
-        <w:rPr>
-          <w:lang w:eastAsia="fr-FR"/>
-        </w:rPr>
-        <w:t xml:space="preserve"> moins de frictions, plus de sécurité, et des décisions plus rapides appuyées par des preuves claires.</w:t>
+        <w:t>Pour les équipes comme pour les utilisateurs, les bénéfices sont concrets au quotidien : moins de frictions, plus de sécurité, et des décisions plus rapides appuyées par des preuves claires.</w:t>
       </w:r>
     </w:p>
     <w:p>
@@ -10004,27 +9956,13 @@
           <w:bCs/>
           <w:lang w:eastAsia="fr-FR"/>
         </w:rPr>
-        <w:t xml:space="preserve">Sécurité </w:t>
-      </w:r>
-      <w:r>
-        <w:rPr>
-          <w:b/>
-          <w:bCs/>
-          <w:lang w:eastAsia="fr-FR"/>
-        </w:rPr>
-        <w:t>renforcée</w:t>
-      </w:r>
-      <w:r>
-        <w:rPr>
-          <w:lang w:eastAsia="fr-FR"/>
-        </w:rPr>
-        <w:t xml:space="preserve"> :</w:t>
-      </w:r>
-      <w:r>
-        <w:rPr>
-          <w:lang w:eastAsia="fr-FR"/>
-        </w:rPr>
-        <w:t xml:space="preserve"> modèle Zero Trust, PAM et IA pour réduire drastiquement les vecteurs d’attaque</w:t>
+        <w:t>Sécurité renforcée</w:t>
+      </w:r>
+      <w:r>
+        <w:rPr>
+          <w:lang w:eastAsia="fr-FR"/>
+        </w:rPr>
+        <w:t xml:space="preserve"> : modèle Zero Trust, PAM et IA pour réduire drastiquement les vecteurs d’attaque</w:t>
       </w:r>
       <w:r>
         <w:rPr>
@@ -10050,27 +9988,13 @@
           <w:bCs/>
           <w:lang w:eastAsia="fr-FR"/>
         </w:rPr>
-        <w:t xml:space="preserve">Gouvernance </w:t>
-      </w:r>
-      <w:r>
-        <w:rPr>
-          <w:b/>
-          <w:bCs/>
-          <w:lang w:eastAsia="fr-FR"/>
-        </w:rPr>
-        <w:t>automatisée</w:t>
-      </w:r>
-      <w:r>
-        <w:rPr>
-          <w:lang w:eastAsia="fr-FR"/>
-        </w:rPr>
-        <w:t xml:space="preserve"> :</w:t>
-      </w:r>
-      <w:r>
-        <w:rPr>
-          <w:lang w:eastAsia="fr-FR"/>
-        </w:rPr>
-        <w:t xml:space="preserve"> conformité continue, revues d’accès périodiques et preuves d’audit prêtes</w:t>
+        <w:t>Gouvernance automatisée</w:t>
+      </w:r>
+      <w:r>
+        <w:rPr>
+          <w:lang w:eastAsia="fr-FR"/>
+        </w:rPr>
+        <w:t xml:space="preserve"> : conformité continue, revues d’accès périodiques et preuves d’audit prêtes</w:t>
       </w:r>
       <w:r>
         <w:rPr>
@@ -10096,27 +10020,13 @@
           <w:bCs/>
           <w:lang w:eastAsia="fr-FR"/>
         </w:rPr>
-        <w:t xml:space="preserve">Coûts </w:t>
-      </w:r>
-      <w:r>
-        <w:rPr>
-          <w:b/>
-          <w:bCs/>
-          <w:lang w:eastAsia="fr-FR"/>
-        </w:rPr>
-        <w:t>maîtrisés</w:t>
-      </w:r>
-      <w:r>
-        <w:rPr>
-          <w:lang w:eastAsia="fr-FR"/>
-        </w:rPr>
-        <w:t xml:space="preserve"> :</w:t>
-      </w:r>
-      <w:r>
-        <w:rPr>
-          <w:lang w:eastAsia="fr-FR"/>
-        </w:rPr>
-        <w:t xml:space="preserve"> gains de productivité, moins d’incidents et moins d’opérations manuelles</w:t>
+        <w:t>Coûts maîtrisés</w:t>
+      </w:r>
+      <w:r>
+        <w:rPr>
+          <w:lang w:eastAsia="fr-FR"/>
+        </w:rPr>
+        <w:t xml:space="preserve"> : gains de productivité, moins d’incidents et moins d’opérations manuelles</w:t>
       </w:r>
       <w:r>
         <w:rPr>
@@ -10142,27 +10052,13 @@
           <w:bCs/>
           <w:lang w:eastAsia="fr-FR"/>
         </w:rPr>
-        <w:t xml:space="preserve">Agilité </w:t>
-      </w:r>
-      <w:r>
-        <w:rPr>
-          <w:b/>
-          <w:bCs/>
-          <w:lang w:eastAsia="fr-FR"/>
-        </w:rPr>
-        <w:t>numérique</w:t>
-      </w:r>
-      <w:r>
-        <w:rPr>
-          <w:lang w:eastAsia="fr-FR"/>
-        </w:rPr>
-        <w:t xml:space="preserve"> :</w:t>
-      </w:r>
-      <w:r>
-        <w:rPr>
-          <w:lang w:eastAsia="fr-FR"/>
-        </w:rPr>
-        <w:t xml:space="preserve"> déploiements rapides, retours arrière fiables et mise à l’échelle sans friction.</w:t>
+        <w:t>Agilité numérique</w:t>
+      </w:r>
+      <w:r>
+        <w:rPr>
+          <w:lang w:eastAsia="fr-FR"/>
+        </w:rPr>
+        <w:t xml:space="preserve"> : déploiements rapides, retours arrière fiables et mise à l’échelle sans friction.</w:t>
       </w:r>
     </w:p>
     <w:p>
@@ -10426,19 +10322,7 @@
         <w:rPr>
           <w:lang w:eastAsia="fr-FR"/>
         </w:rPr>
-        <w:t xml:space="preserve">Concrètement, l’identité de chaque collaborateur suit son parcours </w:t>
-      </w:r>
-      <w:r>
-        <w:rPr>
-          <w:lang w:eastAsia="fr-FR"/>
-        </w:rPr>
-        <w:t>automatiquement :</w:t>
-      </w:r>
-      <w:r>
-        <w:rPr>
-          <w:lang w:eastAsia="fr-FR"/>
-        </w:rPr>
-        <w:t xml:space="preserve"> arrivée, changement de poste, départ. Les accès s’ajustent tout seuls, les comptes inutiles disparaissent, et les actions sensibles sont encadrées par des autorisations temporaires et traçables. En cas d’anomalie, le système détecte, alerte et peut corriger sans attendre.</w:t>
+        <w:t>Concrètement, l’identité de chaque collaborateur suit son parcours automatiquement : arrivée, changement de poste, départ. Les accès s’ajustent tout seuls, les comptes inutiles disparaissent, et les actions sensibles sont encadrées par des autorisations temporaires et traçables. En cas d’anomalie, le système détecte, alerte et peut corriger sans attendre.</w:t>
       </w:r>
     </w:p>
     <w:p>
@@ -10472,19 +10356,7 @@
         <w:rPr>
           <w:lang w:eastAsia="fr-FR"/>
         </w:rPr>
-        <w:t xml:space="preserve">Enfin, les déploiements sont plus rapides et fiables grâce à l’automatisation et aux bonnes pratiques DevOps. La continuité de service est </w:t>
-      </w:r>
-      <w:r>
-        <w:rPr>
-          <w:lang w:eastAsia="fr-FR"/>
-        </w:rPr>
-        <w:t>assurée :</w:t>
-      </w:r>
-      <w:r>
-        <w:rPr>
-          <w:lang w:eastAsia="fr-FR"/>
-        </w:rPr>
-        <w:t xml:space="preserve"> si un incident survient, la reprise est rapide et les pertes sont minimisées.</w:t>
+        <w:t>Enfin, les déploiements sont plus rapides et fiables grâce à l’automatisation et aux bonnes pratiques DevOps. La continuité de service est assurée : si un incident survient, la reprise est rapide et les pertes sont minimisées.</w:t>
       </w:r>
     </w:p>
     <w:p>
@@ -10498,19 +10370,7 @@
         <w:rPr>
           <w:lang w:eastAsia="fr-FR"/>
         </w:rPr>
-        <w:t xml:space="preserve">En résumé, IAM 360° apporte de la sérénité au </w:t>
-      </w:r>
-      <w:r>
-        <w:rPr>
-          <w:lang w:eastAsia="fr-FR"/>
-        </w:rPr>
-        <w:t>quotidien :</w:t>
-      </w:r>
-      <w:r>
-        <w:rPr>
-          <w:lang w:eastAsia="fr-FR"/>
-        </w:rPr>
-        <w:t xml:space="preserve"> moins de tâches manuelles, moins de risques, plus d’efficacité, et une base solide pour évoluer sereinement dans les prochaines années.</w:t>
+        <w:t>En résumé, IAM 360° apporte de la sérénité au quotidien : moins de tâches manuelles, moins de risques, plus d’efficacité, et une base solide pour évoluer sereinement dans les prochaines années.</w:t>
       </w:r>
     </w:p>
     <w:p>
@@ -10669,19 +10529,7 @@
         <w:rPr>
           <w:lang w:eastAsia="fr-FR"/>
         </w:rPr>
-        <w:t xml:space="preserve"> (Identity and Access Management</w:t>
-      </w:r>
-      <w:r>
-        <w:rPr>
-          <w:lang w:eastAsia="fr-FR"/>
-        </w:rPr>
-        <w:t>) :</w:t>
-      </w:r>
-      <w:r>
-        <w:rPr>
-          <w:lang w:eastAsia="fr-FR"/>
-        </w:rPr>
-        <w:t xml:space="preserve"> discipline qui gère les identités numériques, leurs droits d’accès et la gouvernance associée.</w:t>
+        <w:t xml:space="preserve"> (Identity and Access Management) : discipline qui gère les identités numériques, leurs droits d’accès et la gouvernance associée.</w:t>
       </w:r>
     </w:p>
     <w:p>
@@ -10717,19 +10565,7 @@
         <w:rPr>
           <w:lang w:eastAsia="fr-FR"/>
         </w:rPr>
-        <w:t xml:space="preserve"> and Administration</w:t>
-      </w:r>
-      <w:r>
-        <w:rPr>
-          <w:lang w:eastAsia="fr-FR"/>
-        </w:rPr>
-        <w:t>) :</w:t>
-      </w:r>
-      <w:r>
-        <w:rPr>
-          <w:lang w:eastAsia="fr-FR"/>
-        </w:rPr>
-        <w:t xml:space="preserve"> volet IAM qui automatise le cycle de vie des identités (création, modification, suppression), les rôles, les certifications d’accès et la conformité.</w:t>
+        <w:t xml:space="preserve"> and Administration) : volet IAM qui automatise le cycle de vie des identités (création, modification, suppression), les rôles, les certifications d’accès et la conformité.</w:t>
       </w:r>
     </w:p>
     <w:p>
@@ -10751,19 +10587,7 @@
         <w:rPr>
           <w:lang w:eastAsia="fr-FR"/>
         </w:rPr>
-        <w:t xml:space="preserve"> (Access Management</w:t>
-      </w:r>
-      <w:r>
-        <w:rPr>
-          <w:lang w:eastAsia="fr-FR"/>
-        </w:rPr>
-        <w:t>) :</w:t>
-      </w:r>
-      <w:r>
-        <w:rPr>
-          <w:lang w:eastAsia="fr-FR"/>
-        </w:rPr>
-        <w:t xml:space="preserve"> authentification, SSO et contrôle des sessions (politiques MFA, accès conditionnels, gestion des </w:t>
+        <w:t xml:space="preserve"> (Access Management) : authentification, SSO et contrôle des sessions (politiques MFA, accès conditionnels, gestion des </w:t>
       </w:r>
       <w:proofErr w:type="spellStart"/>
       <w:r>
@@ -16913,6 +16737,7 @@
   <w:style w:type="character" w:default="1" w:styleId="Policepardfaut">
     <w:name w:val="Default Paragraph Font"/>
     <w:uiPriority w:val="1"/>
+    <w:semiHidden/>
     <w:unhideWhenUsed/>
   </w:style>
   <w:style w:type="table" w:default="1" w:styleId="TableauNormal">
@@ -18976,8 +18801,10 @@
   <w:rsids>
     <w:rsidRoot w:val="00632C1C"/>
     <w:rsid w:val="000A6772"/>
+    <w:rsid w:val="001463F0"/>
     <w:rsid w:val="001A4EA2"/>
     <w:rsid w:val="00237920"/>
+    <w:rsid w:val="00593844"/>
     <w:rsid w:val="00632C1C"/>
     <w:rsid w:val="00822CB2"/>
     <w:rsid w:val="008D1B7D"/>
@@ -19985,19 +19812,6 @@
 </file>
 
 <file path=customXml/item3.xml><?xml version="1.0" encoding="utf-8"?>
-<?mso-contentType ?>
-<FormTemplates xmlns="http://schemas.microsoft.com/sharepoint/v3/contenttype/forms">
-  <Display>DocumentLibraryForm</Display>
-  <Edit>DocumentLibraryForm</Edit>
-  <New>DocumentLibraryForm</New>
-</FormTemplates>
-</file>
-
-<file path=customXml/item4.xml><?xml version="1.0" encoding="utf-8"?>
-<b:Sources xmlns:b="http://schemas.openxmlformats.org/officeDocument/2006/bibliography" xmlns="http://schemas.openxmlformats.org/officeDocument/2006/bibliography" SelectedStyle="\APASixthEditionOfficeOnline.xsl" StyleName="APA" Version="6"/>
-</file>
-
-<file path=customXml/item5.xml><?xml version="1.0" encoding="utf-8"?>
 <p:properties xmlns:p="http://schemas.microsoft.com/office/2006/metadata/properties" xmlns:xsi="http://www.w3.org/2001/XMLSchema-instance" xmlns:pc="http://schemas.microsoft.com/office/infopath/2007/PartnerControls">
   <documentManagement>
     <Statut xmlns="e5acd629-bdb1-4f3e-abbe-45eef9d692f5" xsi:nil="true"/>
@@ -20007,6 +19821,19 @@
     </lcf76f155ced4ddcb4097134ff3c332f>
   </documentManagement>
 </p:properties>
+</file>
+
+<file path=customXml/item4.xml><?xml version="1.0" encoding="utf-8"?>
+<b:Sources xmlns:b="http://schemas.openxmlformats.org/officeDocument/2006/bibliography" xmlns="http://schemas.openxmlformats.org/officeDocument/2006/bibliography" SelectedStyle="\APASixthEditionOfficeOnline.xsl" StyleName="APA" Version="6"/>
+</file>
+
+<file path=customXml/item5.xml><?xml version="1.0" encoding="utf-8"?>
+<?mso-contentType ?>
+<FormTemplates xmlns="http://schemas.microsoft.com/sharepoint/v3/contenttype/forms">
+  <Display>DocumentLibraryForm</Display>
+  <Edit>DocumentLibraryForm</Edit>
+  <New>DocumentLibraryForm</New>
+</FormTemplates>
 </file>
 
 <file path=customXml/itemProps1.xml><?xml version="1.0" encoding="utf-8"?>
@@ -20037,9 +19864,12 @@
 </file>
 
 <file path=customXml/itemProps3.xml><?xml version="1.0" encoding="utf-8"?>
-<ds:datastoreItem xmlns:ds="http://schemas.openxmlformats.org/officeDocument/2006/customXml" ds:itemID="{3182D099-3A10-4666-BB80-74F4583E8B66}">
+<ds:datastoreItem xmlns:ds="http://schemas.openxmlformats.org/officeDocument/2006/customXml" ds:itemID="{4246B448-BAC0-4CC8-A84E-9258B0C68304}">
   <ds:schemaRefs>
-    <ds:schemaRef ds:uri="http://schemas.microsoft.com/sharepoint/v3/contenttype/forms"/>
+    <ds:schemaRef ds:uri="http://schemas.microsoft.com/office/2006/metadata/properties"/>
+    <ds:schemaRef ds:uri="http://schemas.microsoft.com/office/infopath/2007/PartnerControls"/>
+    <ds:schemaRef ds:uri="e5acd629-bdb1-4f3e-abbe-45eef9d692f5"/>
+    <ds:schemaRef ds:uri="f49c62b5-16f7-4479-b9b9-a09f0e9a6019"/>
   </ds:schemaRefs>
 </ds:datastoreItem>
 </file>
@@ -20053,12 +19883,9 @@
 </file>
 
 <file path=customXml/itemProps5.xml><?xml version="1.0" encoding="utf-8"?>
-<ds:datastoreItem xmlns:ds="http://schemas.openxmlformats.org/officeDocument/2006/customXml" ds:itemID="{4246B448-BAC0-4CC8-A84E-9258B0C68304}">
+<ds:datastoreItem xmlns:ds="http://schemas.openxmlformats.org/officeDocument/2006/customXml" ds:itemID="{3182D099-3A10-4666-BB80-74F4583E8B66}">
   <ds:schemaRefs>
-    <ds:schemaRef ds:uri="http://schemas.microsoft.com/office/2006/metadata/properties"/>
-    <ds:schemaRef ds:uri="http://schemas.microsoft.com/office/infopath/2007/PartnerControls"/>
-    <ds:schemaRef ds:uri="e5acd629-bdb1-4f3e-abbe-45eef9d692f5"/>
-    <ds:schemaRef ds:uri="f49c62b5-16f7-4479-b9b9-a09f0e9a6019"/>
+    <ds:schemaRef ds:uri="http://schemas.microsoft.com/sharepoint/v3/contenttype/forms"/>
   </ds:schemaRefs>
 </ds:datastoreItem>
 </file>
</xml_diff>